<commit_message>
Translate assignment document to French
Co-Authored-By: Claude Opus 5.5 <noreply@anthropic.com>
Claude-Session: https://claude.ai/code/session_011UvKLs6qVxqddLZsD99ujy
</commit_message>
<xml_diff>
--- a/java-oop-exercises/OOP_Assignment.docx
+++ b/java-oop-exercises/OOP_Assignment.docx
@@ -14,7 +14,7 @@
           <w:sz w:val="48"/>
           <w:szCs w:val="48"/>
         </w:rPr>
-        <w:t xml:space="preserve">OOP Assignment</w:t>
+        <w:t xml:space="preserve">Devoir POO (Java)</w:t>
       </w:r>
     </w:p>
     <w:p>
@@ -27,7 +27,7 @@
           <w:sz w:val="28"/>
           <w:szCs w:val="28"/>
         </w:rPr>
-        <w:t xml:space="preserve">Problem Set 3 – Java OOP Exercises</w:t>
+        <w:t xml:space="preserve">Problem Set 3 – Exercices de programmation orientée objet</w:t>
       </w:r>
     </w:p>
     <w:p>
@@ -40,7 +40,7 @@
           <w:sz w:val="24"/>
           <w:szCs w:val="24"/>
         </w:rPr>
-        <w:t xml:space="preserve">Name: ____________________</w:t>
+        <w:t xml:space="preserve">Nom : ____________________</w:t>
       </w:r>
     </w:p>
     <w:p>
@@ -53,7 +53,7 @@
           <w:sz w:val="24"/>
           <w:szCs w:val="24"/>
         </w:rPr>
-        <w:t xml:space="preserve">Course: ____________________</w:t>
+        <w:t xml:space="preserve">Cours : ____________________</w:t>
       </w:r>
     </w:p>
     <w:p>
@@ -66,7 +66,7 @@
           <w:sz w:val="24"/>
           <w:szCs w:val="24"/>
         </w:rPr>
-        <w:t xml:space="preserve">Date: ____________________</w:t>
+        <w:t xml:space="preserve">Date : ____________________</w:t>
       </w:r>
     </w:p>
     <w:p>
@@ -79,7 +79,7 @@
           <w:sz w:val="24"/>
           <w:szCs w:val="24"/>
         </w:rPr>
-        <w:t xml:space="preserve">Exercises: 3, 6 and 7</w:t>
+        <w:t xml:space="preserve">Exercices : 3, 6 et 7</w:t>
       </w:r>
     </w:p>
     <w:p>
@@ -92,7 +92,7 @@
         <w:pStyle w:val="Heading1"/>
       </w:pPr>
       <w:r>
-        <w:t xml:space="preserve">Exercise 3 – School Gradebook</w:t>
+        <w:t xml:space="preserve">Exercice 3 – School Gradebook</w:t>
       </w:r>
     </w:p>
     <w:p>
@@ -108,7 +108,7 @@
         <w:spacing w:after="120"/>
       </w:pPr>
       <w:r>
-        <w:t xml:space="preserve">This program records three assessment scores per student, computes the weighted average (20% / 30% / 50%), gives a letter grade and finds the top student. A score of -1 in the table means the assessment is missing, so the student is shown as incomplete.</w:t>
+        <w:t xml:space="preserve">Ce programme enregistre trois notes par étudiant, calcule la moyenne pondérée (20 % / 30 % / 50 %), attribue une lettre et trouve le meilleur étudiant. Une note de -1 dans le tableau signifie que l'évaluation manque : l'étudiant est alors affiché comme incomplet.</w:t>
       </w:r>
     </w:p>
     <w:p>
@@ -117,7 +117,7 @@
           <w:b/>
           <w:bCs/>
         </w:rPr>
-        <w:t xml:space="preserve">Classes:</w:t>
+        <w:t xml:space="preserve">Classes :</w:t>
       </w:r>
     </w:p>
     <w:p>
@@ -129,7 +129,7 @@
         </w:numPr>
       </w:pPr>
       <w:r>
-        <w:t xml:space="preserve">Person (abstract): name</w:t>
+        <w:t xml:space="preserve">Person (abstraite) : name</w:t>
       </w:r>
     </w:p>
     <w:p>
@@ -141,7 +141,7 @@
         </w:numPr>
       </w:pPr>
       <w:r>
-        <w:t xml:space="preserve">Student extends Person: studentId</w:t>
+        <w:t xml:space="preserve">Student hérite de Person : studentId</w:t>
       </w:r>
     </w:p>
     <w:p>
@@ -153,7 +153,7 @@
         </w:numPr>
       </w:pPr>
       <w:r>
-        <w:t xml:space="preserve">Course: list of students, int[][] scores, average, grade, top student and report</w:t>
+        <w:t xml:space="preserve">Course : liste des étudiants, tableau int[][] des notes, moyenne, lettre, meilleur étudiant et rapport</w:t>
       </w:r>
     </w:p>
     <w:p>
@@ -165,7 +165,7 @@
         </w:numPr>
       </w:pPr>
       <w:r>
-        <w:t xml:space="preserve">GradebookApp: main with the tests</w:t>
+        <w:t xml:space="preserve">GradebookApp : main avec les tests</w:t>
       </w:r>
     </w:p>
     <w:p>
@@ -173,7 +173,7 @@
         <w:pStyle w:val="Heading2"/>
       </w:pPr>
       <w:r>
-        <w:t xml:space="preserve">Source code (GradebookApp.java)</w:t>
+        <w:t xml:space="preserve">Code source (GradebookApp.java)</w:t>
       </w:r>
     </w:p>
     <w:p>
@@ -2832,7 +2832,7 @@
         <w:pStyle w:val="Heading2"/>
       </w:pPr>
       <w:r>
-        <w:t xml:space="preserve">Demonstration</w:t>
+        <w:t xml:space="preserve">Démonstration</w:t>
       </w:r>
     </w:p>
     <w:p>
@@ -2840,7 +2840,7 @@
         <w:spacing w:after="120"/>
       </w:pPr>
       <w:r>
-        <w:t xml:space="preserve">Output of the program (java GradebookApp):</w:t>
+        <w:t xml:space="preserve">Résultat de l'exécution (java GradebookApp) :</w:t>
       </w:r>
     </w:p>
     <w:p>
@@ -2858,7 +2858,7 @@
           <w:iCs/>
           <w:color w:val="888888"/>
         </w:rPr>
-        <w:t xml:space="preserve">[ Insert screenshot here ]</w:t>
+        <w:t xml:space="preserve">[ Insérer la capture d’écran ici ]</w:t>
       </w:r>
     </w:p>
     <w:p>
@@ -2867,7 +2867,7 @@
           <w:b/>
           <w:bCs/>
         </w:rPr>
-        <w:t xml:space="preserve">Test cases shown:</w:t>
+        <w:t xml:space="preserve">Tests présentés :</w:t>
       </w:r>
     </w:p>
     <w:p>
@@ -2879,7 +2879,7 @@
         </w:numPr>
       </w:pPr>
       <w:r>
-        <w:t xml:space="preserve">Test 1: example from the exercise (92.00 A, 93.00 A, 73.00 C, top student S2)</w:t>
+        <w:t xml:space="preserve">Test 1 : exemple de l'énoncé (92.00 A, 93.00 A, 73.00 C, meilleur étudiant S2)</w:t>
       </w:r>
     </w:p>
     <w:p>
@@ -2891,7 +2891,7 @@
         </w:numPr>
       </w:pPr>
       <w:r>
-        <w:t xml:space="preserve">Test 2: scores 0 and 100 accepted, -1 and 101 rejected</w:t>
+        <w:t xml:space="preserve">Test 2 : notes 0 et 100 acceptées, -1 et 101 refusées</w:t>
       </w:r>
     </w:p>
     <w:p>
@@ -2903,7 +2903,7 @@
         </w:numPr>
       </w:pPr>
       <w:r>
-        <w:t xml:space="preserve">Test 3: equal averages, the smallest student ID wins</w:t>
+        <w:t xml:space="preserve">Test 3 : moyennes égales, le plus petit identifiant gagne</w:t>
       </w:r>
     </w:p>
     <w:p>
@@ -2915,7 +2915,7 @@
         </w:numPr>
       </w:pPr>
       <w:r>
-        <w:t xml:space="preserve">Test 4: empty course and incomplete student</w:t>
+        <w:t xml:space="preserve">Test 4 : cours vide et étudiant incomplet</w:t>
       </w:r>
     </w:p>
     <w:p>
@@ -2928,7 +2928,7 @@
         <w:pStyle w:val="Heading1"/>
       </w:pPr>
       <w:r>
-        <w:t xml:space="preserve">Exercise 6 – Shopping Cart Promotion Engine</w:t>
+        <w:t xml:space="preserve">Exercice 6 – Shopping Cart Promotion Engine</w:t>
       </w:r>
     </w:p>
     <w:p>
@@ -2944,7 +2944,7 @@
         <w:spacing w:after="120"/>
       </w:pPr>
       <w:r>
-        <w:t xml:space="preserve">This program builds a shopping cart with grocery items (5% tax) and digital items (15% tax). Items with the same SKU are merged only if they have the same type and the same price. A 5% discount is applied when the total is 200.00 or more.</w:t>
+        <w:t xml:space="preserve">Ce programme gère un panier avec des produits alimentaires (taxe de 5 %) et des produits numériques (taxe de 15 %). Deux articles avec le même SKU sont fusionnés seulement s'ils ont le même type et le même prix. Une remise de 5 % est appliquée si le total atteint 200.00 ou plus.</w:t>
       </w:r>
     </w:p>
     <w:p>
@@ -2953,7 +2953,7 @@
           <w:b/>
           <w:bCs/>
         </w:rPr>
-        <w:t xml:space="preserve">Classes:</w:t>
+        <w:t xml:space="preserve">Classes :</w:t>
       </w:r>
     </w:p>
     <w:p>
@@ -2965,7 +2965,7 @@
         </w:numPr>
       </w:pPr>
       <w:r>
-        <w:t xml:space="preserve">CartItem (abstract): sku, quantity, unitPrice, subtotal()</w:t>
+        <w:t xml:space="preserve">CartItem (abstraite) : sku, quantity, unitPrice, subtotal()</w:t>
       </w:r>
     </w:p>
     <w:p>
@@ -2977,7 +2977,7 @@
         </w:numPr>
       </w:pPr>
       <w:r>
-        <w:t xml:space="preserve">GroceryItem and DigitalItem: override subtotal()</w:t>
+        <w:t xml:space="preserve">GroceryItem et DigitalItem : redéfinissent subtotal()</w:t>
       </w:r>
     </w:p>
     <w:p>
@@ -2989,7 +2989,7 @@
         </w:numPr>
       </w:pPr>
       <w:r>
-        <w:t xml:space="preserve">Cart: add items, merge, sum, discount and receipt</w:t>
+        <w:t xml:space="preserve">Cart : ajout, fusion, somme, remise et ticket</w:t>
       </w:r>
     </w:p>
     <w:p>
@@ -3001,7 +3001,7 @@
         </w:numPr>
       </w:pPr>
       <w:r>
-        <w:t xml:space="preserve">ShoppingCartApp: main with the tests</w:t>
+        <w:t xml:space="preserve">ShoppingCartApp : main avec les tests</w:t>
       </w:r>
     </w:p>
     <w:p>
@@ -3009,7 +3009,7 @@
         <w:pStyle w:val="Heading2"/>
       </w:pPr>
       <w:r>
-        <w:t xml:space="preserve">Source code (ShoppingCartApp.java)</w:t>
+        <w:t xml:space="preserve">Code source (ShoppingCartApp.java)</w:t>
       </w:r>
     </w:p>
     <w:p>
@@ -5514,7 +5514,7 @@
         <w:pStyle w:val="Heading2"/>
       </w:pPr>
       <w:r>
-        <w:t xml:space="preserve">Demonstration</w:t>
+        <w:t xml:space="preserve">Démonstration</w:t>
       </w:r>
     </w:p>
     <w:p>
@@ -5522,7 +5522,7 @@
         <w:spacing w:after="120"/>
       </w:pPr>
       <w:r>
-        <w:t xml:space="preserve">Output of the program (java ShoppingCartApp):</w:t>
+        <w:t xml:space="preserve">Résultat de l'exécution (java ShoppingCartApp) :</w:t>
       </w:r>
     </w:p>
     <w:p>
@@ -5540,7 +5540,7 @@
           <w:iCs/>
           <w:color w:val="888888"/>
         </w:rPr>
-        <w:t xml:space="preserve">[ Insert screenshot here ]</w:t>
+        <w:t xml:space="preserve">[ Insérer la capture d’écran ici ]</w:t>
       </w:r>
     </w:p>
     <w:p>
@@ -5549,7 +5549,7 @@
           <w:b/>
           <w:bCs/>
         </w:rPr>
-        <w:t xml:space="preserve">Test cases shown:</w:t>
+        <w:t xml:space="preserve">Tests présentés :</w:t>
       </w:r>
     </w:p>
     <w:p>
@@ -5561,7 +5561,7 @@
         </w:numPr>
       </w:pPr>
       <w:r>
-        <w:t xml:space="preserve">Test 1: RICE 2 + 3 merged into one line with quantity 5</w:t>
+        <w:t xml:space="preserve">Test 1 : RICE 2 + 3 fusionnés en une seule ligne de quantité 5</w:t>
       </w:r>
     </w:p>
     <w:p>
@@ -5573,7 +5573,7 @@
         </w:numPr>
       </w:pPr>
       <w:r>
-        <w:t xml:space="preserve">Test 2: same SKU with a different price or type is rejected</w:t>
+        <w:t xml:space="preserve">Test 2 : même SKU avec un prix ou un type différent refusé</w:t>
       </w:r>
     </w:p>
     <w:p>
@@ -5585,7 +5585,7 @@
         </w:numPr>
       </w:pPr>
       <w:r>
-        <w:t xml:space="preserve">Test 3: quantity 0 and -2 are rejected</w:t>
+        <w:t xml:space="preserve">Test 3 : quantités 0 et -2 refusées</w:t>
       </w:r>
     </w:p>
     <w:p>
@@ -5597,7 +5597,7 @@
         </w:numPr>
       </w:pPr>
       <w:r>
-        <w:t xml:space="preserve">Test 4: total below 200, no discount</w:t>
+        <w:t xml:space="preserve">Test 4 : total inférieur à 200, pas de remise</w:t>
       </w:r>
     </w:p>
     <w:p>
@@ -5609,7 +5609,7 @@
         </w:numPr>
       </w:pPr>
       <w:r>
-        <w:t xml:space="preserve">Test 5: total exactly 200 and above 200, discount applied</w:t>
+        <w:t xml:space="preserve">Test 5 : total égal à 200 puis supérieur à 200, remise appliquée</w:t>
       </w:r>
     </w:p>
     <w:p>
@@ -5622,7 +5622,7 @@
         <w:pStyle w:val="Heading1"/>
       </w:pPr>
       <w:r>
-        <w:t xml:space="preserve">Exercise 7 – Appointment Scheduling System</w:t>
+        <w:t xml:space="preserve">Exercice 7 – Appointment Scheduling System</w:t>
       </w:r>
     </w:p>
     <w:p>
@@ -5638,7 +5638,7 @@
         <w:spacing w:after="120"/>
       </w:pPr>
       <w:r>
-        <w:t xml:space="preserve">This program schedules consultations and workshops in rooms. Time is stored in minutes after midnight. An appointment is rejected if its ID already exists or if it overlaps another appointment in the same room. The schedule is printed in chronological order.</w:t>
+        <w:t xml:space="preserve">Ce programme planifie des consultations et des ateliers dans des salles. L'heure est stockée en minutes depuis minuit. Un rendez-vous est refusé si son identifiant existe déjà ou s'il chevauche un autre rendez-vous dans la même salle. Le planning est affiché dans l'ordre chronologique.</w:t>
       </w:r>
     </w:p>
     <w:p>
@@ -5647,7 +5647,7 @@
           <w:b/>
           <w:bCs/>
         </w:rPr>
-        <w:t xml:space="preserve">Classes:</w:t>
+        <w:t xml:space="preserve">Classes :</w:t>
       </w:r>
     </w:p>
     <w:p>
@@ -5659,7 +5659,7 @@
         </w:numPr>
       </w:pPr>
       <w:r>
-        <w:t xml:space="preserve">Appointment (abstract): id, startMinute, duration, endMinute, description()</w:t>
+        <w:t xml:space="preserve">Appointment (abstraite) : id, startMinute, duration, endMinute, description()</w:t>
       </w:r>
     </w:p>
     <w:p>
@@ -5671,7 +5671,7 @@
         </w:numPr>
       </w:pPr>
       <w:r>
-        <w:t xml:space="preserve">Consultation and Workshop: room (and capacity for Workshop)</w:t>
+        <w:t xml:space="preserve">Consultation et Workshop : salle (et capacité pour Workshop)</w:t>
       </w:r>
     </w:p>
     <w:p>
@@ -5683,7 +5683,7 @@
         </w:numPr>
       </w:pPr>
       <w:r>
-        <w:t xml:space="preserve">Scheduler: list of appointments, conflict check and sorted listing</w:t>
+        <w:t xml:space="preserve">Scheduler : liste des rendez-vous, vérification des conflits et affichage trié</w:t>
       </w:r>
     </w:p>
     <w:p>
@@ -5695,7 +5695,7 @@
         </w:numPr>
       </w:pPr>
       <w:r>
-        <w:t xml:space="preserve">AppointmentApp: main with the tests</w:t>
+        <w:t xml:space="preserve">AppointmentApp : main avec les tests</w:t>
       </w:r>
     </w:p>
     <w:p>
@@ -5703,7 +5703,7 @@
         <w:pStyle w:val="Heading2"/>
       </w:pPr>
       <w:r>
-        <w:t xml:space="preserve">Source code (AppointmentApp.java)</w:t>
+        <w:t xml:space="preserve">Code source (AppointmentApp.java)</w:t>
       </w:r>
     </w:p>
     <w:p>
@@ -7998,7 +7998,7 @@
         <w:pStyle w:val="Heading2"/>
       </w:pPr>
       <w:r>
-        <w:t xml:space="preserve">Demonstration</w:t>
+        <w:t xml:space="preserve">Démonstration</w:t>
       </w:r>
     </w:p>
     <w:p>
@@ -8006,7 +8006,7 @@
         <w:spacing w:after="120"/>
       </w:pPr>
       <w:r>
-        <w:t xml:space="preserve">Output of the program (java AppointmentApp):</w:t>
+        <w:t xml:space="preserve">Résultat de l'exécution (java AppointmentApp) :</w:t>
       </w:r>
     </w:p>
     <w:p>
@@ -8024,7 +8024,7 @@
           <w:iCs/>
           <w:color w:val="888888"/>
         </w:rPr>
-        <w:t xml:space="preserve">[ Insert screenshot here ]</w:t>
+        <w:t xml:space="preserve">[ Insérer la capture d’écran ici ]</w:t>
       </w:r>
     </w:p>
     <w:p>
@@ -8033,7 +8033,7 @@
           <w:b/>
           <w:bCs/>
         </w:rPr>
-        <w:t xml:space="preserve">Test cases shown:</w:t>
+        <w:t xml:space="preserve">Tests présentés :</w:t>
       </w:r>
     </w:p>
     <w:p>
@@ -8045,7 +8045,7 @@
         </w:numPr>
       </w:pPr>
       <w:r>
-        <w:t xml:space="preserve">Test 1: example from the exercise (W1 rejected, W2 and C2 accepted)</w:t>
+        <w:t xml:space="preserve">Test 1 : exemple de l'énoncé (W1 refusé, W2 et C2 acceptés)</w:t>
       </w:r>
     </w:p>
     <w:p>
@@ -8057,7 +8057,7 @@
         </w:numPr>
       </w:pPr>
       <w:r>
-        <w:t xml:space="preserve">Test 2: duplicate ID rejected</w:t>
+        <w:t xml:space="preserve">Test 2 : identifiant en double refusé</w:t>
       </w:r>
     </w:p>
     <w:p>
@@ -8069,7 +8069,7 @@
         </w:numPr>
       </w:pPr>
       <w:r>
-        <w:t xml:space="preserve">Test 3: invalid duration and appointment past midnight rejected</w:t>
+        <w:t xml:space="preserve">Test 3 : durée invalide et rendez-vous après minuit refusés</w:t>
       </w:r>
     </w:p>
     <w:p>
@@ -8081,7 +8081,7 @@
         </w:numPr>
       </w:pPr>
       <w:r>
-        <w:t xml:space="preserve">Test 4: schedule listed in chronological order</w:t>
+        <w:t xml:space="preserve">Test 4 : planning affiché dans l’ordre chronologique</w:t>
       </w:r>
     </w:p>
     <w:sectPr>

</xml_diff>